<commit_message>
feat: add detailed research methodology section to the proposal document
</commit_message>
<xml_diff>
--- a/Manuskrip/IOP-J-D/_PTM_Proposal/Draf-Proposal-PTM.docx
+++ b/Manuskrip/IOP-J-D/_PTM_Proposal/Draf-Proposal-PTM.docx
@@ -681,7 +681,21 @@
     </w:p>
     <w:p>
       <w:r>
-        <w:t>Peralatan dan bahan yang digunakan dalam penelitian ini disajikan pada Tabel berikut:</w:t>
+        <w:t xml:space="preserve">Penelitian ini memadukan pendekatan fisika eksperimental optik dan komputasi </w:t>
+      </w:r>
+      <w:r>
+        <w:rPr>
+          <w:i/>
+        </w:rPr>
+        <w:t>machine learning</w:t>
+      </w:r>
+      <w:r>
+        <w:t>. Oleh karena itu, instrumen yang digunakan dikategorikan menjadi instrumen perangkat keras eksperimental, infrastruktur komputasi, perangkat lunak penunjang, serta sumber data.</w:t>
+      </w:r>
+    </w:p>
+    <w:p>
+      <w:r>
+        <w:t>Peralatan eksperimen utama yang digunakan untuk pengadaan sampel tanah vulkanik dan penembakan spektral LIBS disajikan pada Tabel berikut:</w:t>
       </w:r>
     </w:p>
     <w:tbl>
@@ -765,7 +779,7 @@
           </w:tcPr>
           <w:p>
             <w:r>
-              <w:t>Q-switched, λ = 1064 nm, pulse energy 114 mJ</w:t>
+              <w:t>Q-switched, λ = 1064 nm, 114 mJ</w:t>
             </w:r>
           </w:p>
         </w:tc>
@@ -881,48 +895,6 @@
           </w:tcPr>
           <w:p>
             <w:r>
-              <w:t>Kabel serat optik</w:t>
-            </w:r>
-          </w:p>
-        </w:tc>
-        <w:tc>
-          <w:tcPr>
-            <w:tcW w:type="dxa" w:w="2160"/>
-          </w:tcPr>
-          <w:p>
-            <w:r>
-              <w:t>Penghantar sinyal emisi plasma</w:t>
-            </w:r>
-          </w:p>
-        </w:tc>
-        <w:tc>
-          <w:tcPr>
-            <w:tcW w:type="dxa" w:w="2160"/>
-          </w:tcPr>
-          <w:p>
-            <w:r>
-              <w:t>1 unit</w:t>
-            </w:r>
-          </w:p>
-        </w:tc>
-      </w:tr>
-      <w:tr>
-        <w:tc>
-          <w:tcPr>
-            <w:tcW w:type="dxa" w:w="2160"/>
-          </w:tcPr>
-          <w:p>
-            <w:r>
-              <w:t>5</w:t>
-            </w:r>
-          </w:p>
-        </w:tc>
-        <w:tc>
-          <w:tcPr>
-            <w:tcW w:type="dxa" w:w="2160"/>
-          </w:tcPr>
-          <w:p>
-            <w:r>
               <w:t>Mesin Hydraulic Press</w:t>
             </w:r>
           </w:p>
@@ -955,7 +927,7 @@
           </w:tcPr>
           <w:p>
             <w:r>
-              <w:t>6</w:t>
+              <w:t>5</w:t>
             </w:r>
           </w:p>
         </w:tc>
@@ -965,7 +937,7 @@
           </w:tcPr>
           <w:p>
             <w:r>
-              <w:t>Mortar dan pestel</w:t>
+              <w:t>Mortar, Pestel, dan Ayakan</w:t>
             </w:r>
           </w:p>
         </w:tc>
@@ -975,7 +947,7 @@
           </w:tcPr>
           <w:p>
             <w:r>
-              <w:t>Penggerusan sampel tanah</w:t>
+              <w:t>Penggerusan dan ayakan 40 mesh (420 µm)</w:t>
             </w:r>
           </w:p>
         </w:tc>
@@ -997,7 +969,7 @@
           </w:tcPr>
           <w:p>
             <w:r>
-              <w:t>7</w:t>
+              <w:t>6</w:t>
             </w:r>
           </w:p>
         </w:tc>
@@ -1007,7 +979,7 @@
           </w:tcPr>
           <w:p>
             <w:r>
-              <w:t>Ayakan 40 mesh (420 µm)</w:t>
+              <w:t>Instrumen XRF</w:t>
             </w:r>
           </w:p>
         </w:tc>
@@ -1017,7 +989,7 @@
           </w:tcPr>
           <w:p>
             <w:r>
-              <w:t>Penyeragaman ukuran partikel</w:t>
+              <w:t>Ground-truth kuantifikasi elemen</w:t>
             </w:r>
           </w:p>
         </w:tc>
@@ -1039,175 +1011,7 @@
           </w:tcPr>
           <w:p>
             <w:r>
-              <w:t>8</w:t>
-            </w:r>
-          </w:p>
-        </w:tc>
-        <w:tc>
-          <w:tcPr>
-            <w:tcW w:type="dxa" w:w="2160"/>
-          </w:tcPr>
-          <w:p>
-            <w:r>
-              <w:t>Cetakan sampel</w:t>
-            </w:r>
-          </w:p>
-        </w:tc>
-        <w:tc>
-          <w:tcPr>
-            <w:tcW w:type="dxa" w:w="2160"/>
-          </w:tcPr>
-          <w:p>
-            <w:r>
-              <w:t>Pembuatan pelet (ketebalan ~4 mm)</w:t>
-            </w:r>
-          </w:p>
-        </w:tc>
-        <w:tc>
-          <w:tcPr>
-            <w:tcW w:type="dxa" w:w="2160"/>
-          </w:tcPr>
-          <w:p>
-            <w:r>
-              <w:t>1 unit</w:t>
-            </w:r>
-          </w:p>
-        </w:tc>
-      </w:tr>
-      <w:tr>
-        <w:tc>
-          <w:tcPr>
-            <w:tcW w:type="dxa" w:w="2160"/>
-          </w:tcPr>
-          <w:p>
-            <w:r>
-              <w:t>9</w:t>
-            </w:r>
-          </w:p>
-        </w:tc>
-        <w:tc>
-          <w:tcPr>
-            <w:tcW w:type="dxa" w:w="2160"/>
-          </w:tcPr>
-          <w:p>
-            <w:r>
-              <w:t>Masker pelindung</w:t>
-            </w:r>
-          </w:p>
-        </w:tc>
-        <w:tc>
-          <w:tcPr>
-            <w:tcW w:type="dxa" w:w="2160"/>
-          </w:tcPr>
-          <w:p>
-            <w:r>
-              <w:t>Keselamatan kerja</w:t>
-            </w:r>
-          </w:p>
-        </w:tc>
-        <w:tc>
-          <w:tcPr>
-            <w:tcW w:type="dxa" w:w="2160"/>
-          </w:tcPr>
-          <w:p>
-            <w:r>
-              <w:t>Secukupnya</w:t>
-            </w:r>
-          </w:p>
-        </w:tc>
-      </w:tr>
-      <w:tr>
-        <w:tc>
-          <w:tcPr>
-            <w:tcW w:type="dxa" w:w="2160"/>
-          </w:tcPr>
-          <w:p>
-            <w:r>
-              <w:t>10</w:t>
-            </w:r>
-          </w:p>
-        </w:tc>
-        <w:tc>
-          <w:tcPr>
-            <w:tcW w:type="dxa" w:w="2160"/>
-          </w:tcPr>
-          <w:p>
-            <w:r>
-              <w:t>GPU Compute Server</w:t>
-            </w:r>
-          </w:p>
-        </w:tc>
-        <w:tc>
-          <w:tcPr>
-            <w:tcW w:type="dxa" w:w="2160"/>
-          </w:tcPr>
-          <w:p>
-            <w:r>
-              <w:t>Pelatihan deep learning (CNN–Transformer)</w:t>
-            </w:r>
-          </w:p>
-        </w:tc>
-        <w:tc>
-          <w:tcPr>
-            <w:tcW w:type="dxa" w:w="2160"/>
-          </w:tcPr>
-          <w:p>
-            <w:r>
-              <w:t>1 unit</w:t>
-            </w:r>
-          </w:p>
-        </w:tc>
-      </w:tr>
-      <w:tr>
-        <w:tc>
-          <w:tcPr>
-            <w:tcW w:type="dxa" w:w="2160"/>
-          </w:tcPr>
-          <w:p>
-            <w:r>
-              <w:t>11</w:t>
-            </w:r>
-          </w:p>
-        </w:tc>
-        <w:tc>
-          <w:tcPr>
-            <w:tcW w:type="dxa" w:w="2160"/>
-          </w:tcPr>
-          <w:p>
-            <w:r>
-              <w:t>Instrumen XRF</w:t>
-            </w:r>
-          </w:p>
-        </w:tc>
-        <w:tc>
-          <w:tcPr>
-            <w:tcW w:type="dxa" w:w="2160"/>
-          </w:tcPr>
-          <w:p>
-            <w:r>
-              <w:t>Ground-truth konsentrasi elemen</w:t>
-            </w:r>
-          </w:p>
-        </w:tc>
-        <w:tc>
-          <w:tcPr>
-            <w:tcW w:type="dxa" w:w="2160"/>
-          </w:tcPr>
-          <w:p>
-            <w:r>
-              <w:t>1 unit</w:t>
-            </w:r>
-          </w:p>
-        </w:tc>
-      </w:tr>
-      <w:tr>
-        <w:tc>
-          <w:tcPr>
-            <w:tcW w:type="dxa" w:w="2160"/>
-          </w:tcPr>
-          <w:p>
-            <w:r>
-              <w:t>12</w:t>
+              <w:t>7</w:t>
             </w:r>
           </w:p>
         </w:tc>
@@ -1227,7 +1031,7 @@
           </w:tcPr>
           <w:p>
             <w:r>
-              <w:t>Gunung Seulawah Agam, Aceh (4 arah × 3 kedalaman)</w:t>
+              <w:t>G. Seulawah Agam (4 arah × 3 kedalaman)</w:t>
             </w:r>
           </w:p>
         </w:tc>
@@ -1243,6 +1047,130 @@
         </w:tc>
       </w:tr>
     </w:tbl>
+    <w:p>
+      <w:r>
+        <w:t xml:space="preserve">Untuk mengakomodasi kalkulasi dari pembuatan arsitektur </w:t>
+      </w:r>
+      <w:r>
+        <w:rPr>
+          <w:i/>
+        </w:rPr>
+        <w:t>deep learning</w:t>
+      </w:r>
+      <w:r>
+        <w:t xml:space="preserve"> (CNN–Transformer) dan </w:t>
+      </w:r>
+      <w:r>
+        <w:rPr>
+          <w:i/>
+        </w:rPr>
+        <w:t>forward modeling</w:t>
+      </w:r>
+      <w:r>
+        <w:t xml:space="preserve"> data sintetis, penelitian ini memerlukan kapabilitas komputasi berkinerja tinggi yang disokong oleh:</w:t>
+      </w:r>
+    </w:p>
+    <w:p>
+      <w:pPr>
+        <w:pStyle w:val="ListNumber"/>
+      </w:pPr>
+      <w:r>
+        <w:t>Laptop Apple MacBook Air M1 2020: Dilengkapi dengan prosesor Apple M1, memori (RAM) sebesar 8 GB, dan penyimpanan SSD. Perangkat ini secara utama digunakan untuk pengembangan skrip kode lokal, eksplorasi matematis awal, dan penyusunan laporan akademis.</w:t>
+      </w:r>
+    </w:p>
+    <w:p>
+      <w:pPr>
+        <w:pStyle w:val="ListNumber"/>
+      </w:pPr>
+      <w:r>
+        <w:t>Infrastruktur High Performance Computing (HPC) Mahameru 4 BRIN: Infrastruktur ini digunakan secara masif untuk simulasi spektroskopi emisi sintetis berskala besar dan pelatihan model CNN--Transformer yang intensif secara komputasi. Spesifikasi komputasinya meliputi:</w:t>
+      </w:r>
+    </w:p>
+    <w:p>
+      <w:pPr>
+        <w:pStyle w:val="ListNumber"/>
+      </w:pPr>
+      <w:r>
+        <w:t>Klaster CPU: 92 compute node dengan dual prosesor Xeon Gold (sekitar 32 core per node) dan 256 GB RAM per node. Terdapat 1 high memory node dengan kapasitas memori hingga 1.5 TB.</w:t>
+      </w:r>
+    </w:p>
+    <w:p>
+      <w:pPr>
+        <w:pStyle w:val="ListNumber"/>
+      </w:pPr>
+      <w:r>
+        <w:t>Klaster GPU: Terkonsolidasi dari berbagai akselerator Graphics Processing Unit kelas berat (di antaranya varian NVIDIA DGX A100, V100, dan P100).</w:t>
+      </w:r>
+    </w:p>
+    <w:p>
+      <w:pPr>
+        <w:pStyle w:val="ListNumber"/>
+      </w:pPr>
+      <w:r>
+        <w:t>Sistem Penyimpanan: Kapasitas masif total 4.5 PB, didukung arsitektur High Performance SSD untuk menampung matriks HDF5 berjuta-baris dengan efisien.</w:t>
+      </w:r>
+    </w:p>
+    <w:p>
+      <w:pPr>
+        <w:pStyle w:val="ListNumber"/>
+      </w:pPr>
+      <w:r>
+        <w:t>Jaringan Interkoneksi: InfiniBand HDR (dengan laju transfer 100 Gbps antar sistem server).</w:t>
+      </w:r>
+    </w:p>
+    <w:p>
+      <w:pPr>
+        <w:pStyle w:val="ListNumber"/>
+      </w:pPr>
+      <w:r>
+        <w:t>Sistem Penjadwalan Job: Dikelola melalui antrian basis SLURM (Simple Linux Utility for Resource Management).</w:t>
+      </w:r>
+    </w:p>
+    <w:p>
+      <w:r>
+        <w:t>Siklus komputasional dan eksekusi jaringan model difasilitasi melalui perangkat lunak berikut:</w:t>
+      </w:r>
+    </w:p>
+    <w:p>
+      <w:pPr>
+        <w:pStyle w:val="ListNumber"/>
+      </w:pPr>
+      <w:r>
+        <w:t>Sistem Operasi &amp; Lingkungan: macOS Ventura 13.6 pada perangkat lokal, dan mesin berbasis Ubuntu Linux pada arsitektur server High Performance Computing.</w:t>
+      </w:r>
+    </w:p>
+    <w:p>
+      <w:pPr>
+        <w:pStyle w:val="ListNumber"/>
+      </w:pPr>
+      <w:r>
+        <w:t>Bahasa Pemrograman: Python 3.10 ditetapkan sebagai ekosistem operasional primer yang disokong oleh antarmuka Jupyter Notebook interaktif untuk validasi prototipe.</w:t>
+      </w:r>
+    </w:p>
+    <w:p>
+      <w:pPr>
+        <w:pStyle w:val="ListNumber"/>
+      </w:pPr>
+      <w:r>
+        <w:t>Pustaka Algoritma Deep Learning: PyTorch dipilih secara esensial sebagai kerangka kerja tulang punggung arsitektur neural (sub-rutin Convolution dan Cross-Attention). Digabungkan spesifik dengan modul TensorBoard untuk pemantauan kurva iteratif metrik regresi per-epoch (Paszke et al., 2019).</w:t>
+      </w:r>
+    </w:p>
+    <w:p>
+      <w:pPr>
+        <w:pStyle w:val="ListNumber"/>
+      </w:pPr>
+      <w:r>
+        <w:t>Pustaka Sains Data (Data Science): NumPy dan Pandas dimanfaatkan khusus merekayasa kompilasi baris numerik dimensi tinggi; modul h5py murni sebagai pengelola file ekspor set data spektral HDF5; scikit-learn mengeksekusi rotasi grup 5-fold cross validation &amp; skor akurasi; serta Matplotlib / Seaborn yang memperindah render visual. Modul standar Python itertools juga dilibatkan dalam iterasi logik kompleks.</w:t>
+      </w:r>
+    </w:p>
+    <w:p>
+      <w:pPr>
+        <w:pStyle w:val="ListNumber"/>
+      </w:pPr>
+      <w:r>
+        <w:t>NIST Atomic Spectra Database (ASD): Merupakan basis kompilasi standar yang diakses langsung pada server National Institute of Standards and Technology (Kramida et al., 2024). Ekstraksi dari tabel spektra ini menyuplai pondasi variabel kuantum seperti batas energi ionisasi ($E_{\infty,i}$), eksitasi energi status ($E_k, E_i$), degenerasi probabilitas ($g_k, g_i$), hingga peluruhan transisi foton ($A_{ki}$) yang menentukan keberhasilan dari algoritma fisika plasma termodinamika buatan kita.</w:t>
+      </w:r>
+    </w:p>
     <w:p>
       <w:pPr>
         <w:pStyle w:val="Heading3"/>
@@ -2388,7 +2316,7 @@
           </w:tcPr>
           <w:p>
             <w:r>
-              <w:t>2. Penghitungan populasi tiap tingkat ionisasi menggunakan Persamaan Saha dan distribusi keadaan tereksitasi menggunakan Distribusi Boltzmann (Fujimoto, 2004). Parameter plasma di-sampling secara acak seragam: T_e ∈ [6.000–15.000] K, n_e ∈ [10^16 – 10^17] cm^{-3}. Rentang ini dipilih berdasarkan kondisi tipikal plasma LIBS pada tekanan atmosfer (Cristoforetti et al., 2010), dengan mempertimbangkan variasi yang mungkin terjadi pada berbagai jenis matriks sampel.</w:t>
+              <w:t>2. Penghitungan populasi analit memanfaatkan fondasi kesetimbangan termodinamika lokal (Local Thermodynamic Equilibrium / LTE). Distribusi elektron tereksitasi pada tingkat energi spesifik dikalkulasi berdasarkan Distribusi Boltzmann, dan keseimbangan densitas antar tingkat ionisasi saling berurutan dihitung menggunakan Persamaan Saha (Fujimoto, 2004). Parameter plasma dominan (Suhu elektron, T_e dan densitas elektron, n_e) pada kalkulasi fundamental ini kemudian di-sampling secara acak seragam: T_e ∈ [6.000–15.000] K, n_e ∈ [10^16 – 10^17] cm^{-3}. Pemilihan rentang ini secara sengaja disusun menyerupai kondisi tipikal transien plasma spektrum LIBS pada tekanan udara terbuka (Cristoforetti et al., 2010).</w:t>
             </w:r>
           </w:p>
         </w:tc>
@@ -2561,6 +2489,318 @@
           </w:p>
         </w:tc>
       </w:tr>
+      <w:tr>
+        <w:tc>
+          <w:tcPr>
+            <w:tcW w:type="dxa" w:w="2160"/>
+          </w:tcPr>
+          <w:p>
+            <w:r>
+              <w:t>7. Ringkasan seluruh parameter fisis dan komputasional yang dilibatkan dalam simulasi forward model spektral sintetis ini dirangkum pada Tabel berikut.</w:t>
+            </w:r>
+          </w:p>
+        </w:tc>
+        <w:tc>
+          <w:tcPr>
+            <w:tcW w:type="dxa" w:w="2160"/>
+          </w:tcPr>
+          <w:p>
+            <w:r/>
+          </w:p>
+        </w:tc>
+        <w:tc>
+          <w:tcPr>
+            <w:tcW w:type="dxa" w:w="2160"/>
+          </w:tcPr>
+          <w:p>
+            <w:r/>
+          </w:p>
+        </w:tc>
+        <w:tc>
+          <w:tcPr>
+            <w:tcW w:type="dxa" w:w="2160"/>
+          </w:tcPr>
+          <w:p>
+            <w:r/>
+          </w:p>
+        </w:tc>
+      </w:tr>
+    </w:tbl>
+    <w:p>
+      <w:r>
+        <w:rPr>
+          <w:b/>
+        </w:rPr>
+        <w:t>Tabel Parameter Fisis dan Instrumental Simulasi Data Sintetis</w:t>
+      </w:r>
+    </w:p>
+    <w:tbl>
+      <w:tblPr>
+        <w:tblStyle w:val="TableGrid"/>
+        <w:tblW w:type="auto" w:w="0"/>
+        <w:tblLook w:firstColumn="1" w:firstRow="1" w:lastColumn="0" w:lastRow="0" w:noHBand="0" w:noVBand="1" w:val="04A0"/>
+      </w:tblPr>
+      <w:tblGrid>
+        <w:gridCol w:w="2880"/>
+        <w:gridCol w:w="2880"/>
+        <w:gridCol w:w="2880"/>
+      </w:tblGrid>
+      <w:tr>
+        <w:tc>
+          <w:tcPr>
+            <w:tcW w:type="dxa" w:w="2880"/>
+          </w:tcPr>
+          <w:p>
+            <w:r>
+              <w:t>Kategori / Parameter</w:t>
+            </w:r>
+          </w:p>
+        </w:tc>
+        <w:tc>
+          <w:tcPr>
+            <w:tcW w:type="dxa" w:w="2880"/>
+          </w:tcPr>
+          <w:p>
+            <w:r>
+              <w:t>Nilai / Rentang</w:t>
+            </w:r>
+          </w:p>
+        </w:tc>
+        <w:tc>
+          <w:tcPr>
+            <w:tcW w:type="dxa" w:w="2880"/>
+          </w:tcPr>
+          <w:p>
+            <w:r>
+              <w:t>Keterangan</w:t>
+            </w:r>
+          </w:p>
+        </w:tc>
+      </w:tr>
+      <w:tr>
+        <w:tc>
+          <w:tcPr>
+            <w:tcW w:type="dxa" w:w="2880"/>
+          </w:tcPr>
+          <w:p>
+            <w:r>
+              <w:t>Rentang Suhu Elektron ($T_e$)</w:t>
+            </w:r>
+          </w:p>
+        </w:tc>
+        <w:tc>
+          <w:tcPr>
+            <w:tcW w:type="dxa" w:w="2880"/>
+          </w:tcPr>
+          <w:p>
+            <w:r>
+              <w:t>6.000 – 15.000 K</w:t>
+            </w:r>
+          </w:p>
+        </w:tc>
+        <w:tc>
+          <w:tcPr>
+            <w:tcW w:type="dxa" w:w="2880"/>
+          </w:tcPr>
+          <w:p>
+            <w:r>
+              <w:t>Memodelkan fluktuasi pendinginan plasma</w:t>
+            </w:r>
+          </w:p>
+        </w:tc>
+      </w:tr>
+      <w:tr>
+        <w:tc>
+          <w:tcPr>
+            <w:tcW w:type="dxa" w:w="2880"/>
+          </w:tcPr>
+          <w:p>
+            <w:r>
+              <w:t>Rentang Densitas Elektron ($n_e$)</w:t>
+            </w:r>
+          </w:p>
+        </w:tc>
+        <w:tc>
+          <w:tcPr>
+            <w:tcW w:type="dxa" w:w="2880"/>
+          </w:tcPr>
+          <w:p>
+            <w:r>
+              <w:t>$10^{16}$ – $10^{17}$ $\text{cm}^{-3}$</w:t>
+            </w:r>
+          </w:p>
+        </w:tc>
+        <w:tc>
+          <w:tcPr>
+            <w:tcW w:type="dxa" w:w="2880"/>
+          </w:tcPr>
+          <w:p>
+            <w:r>
+              <w:t>Memenuhi kriteria McWhirter untuk LTE</w:t>
+            </w:r>
+          </w:p>
+        </w:tc>
+      </w:tr>
+      <w:tr>
+        <w:tc>
+          <w:tcPr>
+            <w:tcW w:type="dxa" w:w="2880"/>
+          </w:tcPr>
+          <w:p>
+            <w:r>
+              <w:t>Rentang Spektral ($\lambda$)</w:t>
+            </w:r>
+          </w:p>
+        </w:tc>
+        <w:tc>
+          <w:tcPr>
+            <w:tcW w:type="dxa" w:w="2880"/>
+          </w:tcPr>
+          <w:p>
+            <w:r>
+              <w:t>200 – 900 nm</w:t>
+            </w:r>
+          </w:p>
+        </w:tc>
+        <w:tc>
+          <w:tcPr>
+            <w:tcW w:type="dxa" w:w="2880"/>
+          </w:tcPr>
+          <w:p>
+            <w:r>
+              <w:t>Kesesuaian rentang Echelle spectrometer</w:t>
+            </w:r>
+          </w:p>
+        </w:tc>
+      </w:tr>
+      <w:tr>
+        <w:tc>
+          <w:tcPr>
+            <w:tcW w:type="dxa" w:w="2880"/>
+          </w:tcPr>
+          <w:p>
+            <w:r>
+              <w:t>Resolusi Sistem (FWHM)</w:t>
+            </w:r>
+          </w:p>
+        </w:tc>
+        <w:tc>
+          <w:tcPr>
+            <w:tcW w:type="dxa" w:w="2880"/>
+          </w:tcPr>
+          <w:p>
+            <w:r>
+              <w:t>0.02 nm</w:t>
+            </w:r>
+          </w:p>
+        </w:tc>
+        <w:tc>
+          <w:tcPr>
+            <w:tcW w:type="dxa" w:w="2880"/>
+          </w:tcPr>
+          <w:p>
+            <w:r>
+              <w:t>Resolusi optik instrumental</w:t>
+            </w:r>
+          </w:p>
+        </w:tc>
+      </w:tr>
+      <w:tr>
+        <w:tc>
+          <w:tcPr>
+            <w:tcW w:type="dxa" w:w="2880"/>
+          </w:tcPr>
+          <w:p>
+            <w:r>
+              <w:t>Profil Bentuk Garis Emisi</w:t>
+            </w:r>
+          </w:p>
+        </w:tc>
+        <w:tc>
+          <w:tcPr>
+            <w:tcW w:type="dxa" w:w="2880"/>
+          </w:tcPr>
+          <w:p>
+            <w:r>
+              <w:t>Kurva Voigt</w:t>
+            </w:r>
+          </w:p>
+        </w:tc>
+        <w:tc>
+          <w:tcPr>
+            <w:tcW w:type="dxa" w:w="2880"/>
+          </w:tcPr>
+          <w:p>
+            <w:r>
+              <w:t>Transisi termal pelebaran Doppler &amp; Stark</w:t>
+            </w:r>
+          </w:p>
+        </w:tc>
+      </w:tr>
+      <w:tr>
+        <w:tc>
+          <w:tcPr>
+            <w:tcW w:type="dxa" w:w="2880"/>
+          </w:tcPr>
+          <w:p>
+            <w:r>
+              <w:t>Fungsi Pelebaran Optik</w:t>
+            </w:r>
+          </w:p>
+        </w:tc>
+        <w:tc>
+          <w:tcPr>
+            <w:tcW w:type="dxa" w:w="2880"/>
+          </w:tcPr>
+          <w:p>
+            <w:r>
+              <w:t>Gaussian</w:t>
+            </w:r>
+          </w:p>
+        </w:tc>
+        <w:tc>
+          <w:tcPr>
+            <w:tcW w:type="dxa" w:w="2880"/>
+          </w:tcPr>
+          <w:p>
+            <w:r>
+              <w:t>Karakterisasi difraksi grating</w:t>
+            </w:r>
+          </w:p>
+        </w:tc>
+      </w:tr>
+      <w:tr>
+        <w:tc>
+          <w:tcPr>
+            <w:tcW w:type="dxa" w:w="2880"/>
+          </w:tcPr>
+          <w:p>
+            <w:r>
+              <w:t>Total Data</w:t>
+            </w:r>
+          </w:p>
+        </w:tc>
+        <w:tc>
+          <w:tcPr>
+            <w:tcW w:type="dxa" w:w="2880"/>
+          </w:tcPr>
+          <w:p>
+            <w:r>
+              <w:t>10.000 pasang</w:t>
+            </w:r>
+          </w:p>
+        </w:tc>
+        <w:tc>
+          <w:tcPr>
+            <w:tcW w:type="dxa" w:w="2880"/>
+          </w:tcPr>
+          <w:p>
+            <w:r>
+              <w:t>Varians komprehensif untuk Deep Learning</w:t>
+            </w:r>
+          </w:p>
+        </w:tc>
+      </w:tr>
     </w:tbl>
     <w:p>
       <w:r>
@@ -2939,16 +3179,16 @@
       </w:r>
     </w:p>
     <w:p>
-      <w:r>
-        <w:rPr>
-          <w:b/>
-        </w:rPr>
-        <w:t>2f. Pengolahan dan Analisis Data</w:t>
+      <w:pPr>
+        <w:pStyle w:val="Heading3"/>
+      </w:pPr>
+      <w:r>
+        <w:t>Analisa Sampel dan Pengolahan Data</w:t>
       </w:r>
     </w:p>
     <w:p>
       <w:r>
-        <w:t>Hasil eksperimen dianalisis melalui beberapa tahap:</w:t>
+        <w:t>Hasil akuisisi eksperimental dianalisis lebih lanjut melalui serangkaian tahapan komputasional. Pemrosesan data mentah dan analisis luaran model mencakup:</w:t>
         <w:br/>
         <w:t xml:space="preserve">- </w:t>
       </w:r>
@@ -2959,7 +3199,16 @@
         <w:t>Pra-pemrosesan spektrum</w:t>
       </w:r>
       <w:r>
-        <w:t xml:space="preserve">: normalisasi intensitas, koreksi </w:t>
+        <w:t>: normalisasi intensitas terhadap kurva respons sistem (</w:t>
+      </w:r>
+      <w:r>
+        <w:rPr>
+          <w:i/>
+        </w:rPr>
+        <w:t>instrumental response</w:t>
+      </w:r>
+      <w:r>
+        <w:t xml:space="preserve">), koreksi kontinum </w:t>
       </w:r>
       <w:r>
         <w:rPr>
@@ -2968,7 +3217,16 @@
         <w:t>baseline</w:t>
       </w:r>
       <w:r>
-        <w:t>, dan segmentasi rentang panjang gelombang yang relevan.</w:t>
+        <w:t xml:space="preserve"> melalui algoritma polynomial fitting, dan segmentasi rentang panjang gelombang fokus untuk membuang </w:t>
+      </w:r>
+      <w:r>
+        <w:rPr>
+          <w:i/>
+        </w:rPr>
+        <w:t>background noise</w:t>
+      </w:r>
+      <w:r>
+        <w:t>.</w:t>
         <w:br/>
         <w:t xml:space="preserve">- </w:t>
       </w:r>
@@ -2979,7 +3237,16 @@
         <w:t>Identifikasi garis emisi</w:t>
       </w:r>
       <w:r>
-        <w:t>: pencocokan puncak emisi dengan database NIST ASD untuk verifikasi keberadaan elemen target.</w:t>
+        <w:t xml:space="preserve">: pencocokan otomatis antar puncak profil spektrum yang terukur dengan </w:t>
+      </w:r>
+      <w:r>
+        <w:rPr>
+          <w:i/>
+        </w:rPr>
+        <w:t>database</w:t>
+      </w:r>
+      <w:r>
+        <w:t xml:space="preserve"> referensi NIST ASD guna memvalidasi keberadaan matriks elemen target.</w:t>
         <w:br/>
         <w:t xml:space="preserve">- </w:t>
       </w:r>
@@ -2990,7 +3257,25 @@
         <w:t>Inferensi model</w:t>
       </w:r>
       <w:r>
-        <w:t>: spektrum eksperimental yang telah di-pra-proses dimasukkan ke model CNN–Transformer yang telah dilatih untuk memprediksi konsentrasi elemen.</w:t>
+        <w:t xml:space="preserve">: spektrum eksperimental yang telah bersih diumpankan ke model prediksi </w:t>
+      </w:r>
+      <w:r>
+        <w:rPr>
+          <w:i/>
+        </w:rPr>
+        <w:t>deep learning</w:t>
+      </w:r>
+      <w:r>
+        <w:t xml:space="preserve"> (CNN–Transformer) yang telah terbiasa dengan spektrum sintetis untuk mengekstrak vektor konsentrasi elemen (</w:t>
+      </w:r>
+      <w:r>
+        <w:rPr>
+          <w:i/>
+        </w:rPr>
+        <w:t>end-to-end mapping</w:t>
+      </w:r>
+      <w:r>
+        <w:t>).</w:t>
         <w:br/>
         <w:t xml:space="preserve">- </w:t>
       </w:r>
@@ -3001,7 +3286,16 @@
         <w:t>Analisis komparatif</w:t>
       </w:r>
       <w:r>
-        <w:t>: perbandingan prediksi konsentrasi dari model dengan hasil pengukuran XRF (ground-truth).</w:t>
+        <w:t>: penyelarasan keluaran prediksi konsentrasi dari pemodelan AI terhadap perolehan data eksak XRF sebagai landasan validasi metrik (</w:t>
+      </w:r>
+      <w:r>
+        <w:rPr>
+          <w:i/>
+        </w:rPr>
+        <w:t>ground-truth</w:t>
+      </w:r>
+      <w:r>
+        <w:t>).</w:t>
       </w:r>
     </w:p>
     <w:p>
@@ -3009,12 +3303,12 @@
         <w:rPr>
           <w:b/>
         </w:rPr>
-        <w:t>2g. Protokol Evaluasi</w:t>
+        <w:t>Protokol Evaluasi Metrik</w:t>
       </w:r>
     </w:p>
     <w:p>
       <w:r>
-        <w:t>Evaluasi performa model dilakukan secara komprehensif dengan protokol sebagai berikut:</w:t>
+        <w:t>Evaluasi kapabilitas analitik model dihimpun secara komprehensif menggunakan protokol:</w:t>
         <w:br/>
         <w:t xml:space="preserve">- </w:t>
       </w:r>
@@ -3025,7 +3319,34 @@
         <w:t>3 metrik kuantitatif per elemen</w:t>
       </w:r>
       <w:r>
-        <w:t>: Root Mean Square Error (RMSE) untuk mengukur deviasi prediksi, koefisien determinasi (R²) untuk mengukur proporsi variansi yang dijelaskan model, dan Mean Absolute Percentage Error (MAPE) untuk mengukur akurasi relatif.</w:t>
+        <w:t xml:space="preserve">: </w:t>
+      </w:r>
+      <w:r>
+        <w:rPr>
+          <w:i/>
+        </w:rPr>
+        <w:t>Root Mean Square Error</w:t>
+      </w:r>
+      <w:r>
+        <w:t xml:space="preserve"> (RMSE) untuk melacak rata-rata deviasi kuadratik, </w:t>
+      </w:r>
+      <w:r>
+        <w:rPr>
+          <w:i/>
+        </w:rPr>
+        <w:t>Koefisien Determinasi</w:t>
+      </w:r>
+      <w:r>
+        <w:t xml:space="preserve"> (R²) memonitor proporsi korelasi linier prediksi absolut, dan </w:t>
+      </w:r>
+      <w:r>
+        <w:rPr>
+          <w:i/>
+        </w:rPr>
+        <w:t>Mean Absolute Percentage Error</w:t>
+      </w:r>
+      <w:r>
+        <w:t xml:space="preserve"> (MAPE) sebagai parameter akurasi relatif spasial.</w:t>
         <w:br/>
         <w:t xml:space="preserve">- </w:t>
       </w:r>
@@ -3036,16 +3357,25 @@
         <w:t>4 model baseline</w:t>
       </w:r>
       <w:r>
-        <w:t xml:space="preserve"> sebagai pembanding: PLS — Partial Least Squares (Wold et al., 2001) sebagai representasi metode kemometrik klasik, CNN-only dan Transformer-only sebagai komponen ablasi arsitektur, serta Informer (Zhou et al., 2021; Walidain et al., 2026) sebagai representasi model </w:t>
+        <w:t xml:space="preserve"> sebagai komparasi ketangguhan: PLS — </w:t>
       </w:r>
       <w:r>
         <w:rPr>
           <w:i/>
         </w:rPr>
-        <w:t>sequence-to-sequence</w:t>
-      </w:r>
-      <w:r>
-        <w:t xml:space="preserve"> terkini.</w:t>
+        <w:t>Partial Least Squares</w:t>
+      </w:r>
+      <w:r>
+        <w:t xml:space="preserve"> (Wold et al., 2001) sebagai representasi perbandingan regresi kemometrik klasik, model spasial diskrit (CNN-only), penyesuai sekuens independen (Transformer-only), dan arsitektur canggih </w:t>
+      </w:r>
+      <w:r>
+        <w:rPr>
+          <w:i/>
+        </w:rPr>
+        <w:t>Informer</w:t>
+      </w:r>
+      <w:r>
+        <w:t xml:space="preserve"> (Zhou et al., 2021).</w:t>
         <w:br/>
         <w:t xml:space="preserve">- </w:t>
       </w:r>
@@ -3053,10 +3383,37 @@
         <w:rPr>
           <w:b/>
         </w:rPr>
-        <w:t>Validasi</w:t>
-      </w:r>
-      <w:r>
-        <w:t>: stratified 5-fold cross-validation pada dataset eksperimental untuk memastikan robustness estimasi performa.</w:t>
+        <w:t>Keterandalan Lintas-Validasi</w:t>
+      </w:r>
+      <w:r>
+        <w:t xml:space="preserve">: </w:t>
+      </w:r>
+      <w:r>
+        <w:rPr>
+          <w:i/>
+        </w:rPr>
+        <w:t>stratified 5-fold cross-validation</w:t>
+      </w:r>
+      <w:r>
+        <w:t xml:space="preserve"> diimplementasikan pada dataset eksperimental untuk menihilkan anomali uji (mencegah </w:t>
+      </w:r>
+      <w:r>
+        <w:rPr>
+          <w:i/>
+        </w:rPr>
+        <w:t>overfitting</w:t>
+      </w:r>
+      <w:r>
+        <w:t xml:space="preserve">) serta menyajikan jaminan </w:t>
+      </w:r>
+      <w:r>
+        <w:rPr>
+          <w:i/>
+        </w:rPr>
+        <w:t>robustness</w:t>
+      </w:r>
+      <w:r>
+        <w:t xml:space="preserve"> validasi.</w:t>
         <w:br/>
         <w:t xml:space="preserve">- </w:t>
       </w:r>
@@ -3064,10 +3421,10 @@
         <w:rPr>
           <w:b/>
         </w:rPr>
-        <w:t>Interpretabilitas</w:t>
-      </w:r>
-      <w:r>
-        <w:t xml:space="preserve">: analisis bobot </w:t>
+        <w:t>Interpretabilitas Fisik</w:t>
+      </w:r>
+      <w:r>
+        <w:t xml:space="preserve">: penelusuran balik bobot koneksi </w:t>
       </w:r>
       <w:r>
         <w:rPr>
@@ -3076,7 +3433,25 @@
         <w:t>cross-attention</w:t>
       </w:r>
       <w:r>
-        <w:t xml:space="preserve"> antara decoder dan encoder → identifikasi apakah model secara otomatis menemukan region spektral spesifik elemen yang konsisten dengan garis emisi NIST yang diketahui. Analisis ini menjadi validasi bahwa model benar-benar mempelajari dekomposisi mono–poliatomik yang bermakna secara fisik, bukan sekadar korelasi statistik.</w:t>
+        <w:t xml:space="preserve"> dari matriks </w:t>
+      </w:r>
+      <w:r>
+        <w:rPr>
+          <w:i/>
+        </w:rPr>
+        <w:t>decoder</w:t>
+      </w:r>
+      <w:r>
+        <w:t xml:space="preserve"> ke </w:t>
+      </w:r>
+      <w:r>
+        <w:rPr>
+          <w:i/>
+        </w:rPr>
+        <w:t>encoder</w:t>
+      </w:r>
+      <w:r>
+        <w:t>. Pendekatan ini melegitimasi apakah mesin neural secara mandiri menemukan hubungan spasi-waktu transisi kuantum elemen, menegaskan bahwa simulasi benar-benar mempelajari dekomposisi mono–poliatomik sesuai hukum fisika yang presisi.</w:t>
       </w:r>
     </w:p>
     <w:p>

</xml_diff>

<commit_message>
refactor: reorganize project structure by replacing research methodology files with a consolidated proposal document and roadmap resources
</commit_message>
<xml_diff>
--- a/Manuskrip/IOP-J-D/_PTM_Proposal/Draf-Proposal-PTM.docx
+++ b/Manuskrip/IOP-J-D/_PTM_Proposal/Draf-Proposal-PTM.docx
@@ -1176,21 +1176,34 @@
         <w:pStyle w:val="Heading3"/>
       </w:pPr>
       <w:r>
-        <w:t>Prosedur Penelitian</w:t>
+        <w:t>Diagram Alir Penelitian</w:t>
       </w:r>
     </w:p>
     <w:p>
       <w:r>
-        <w:t xml:space="preserve">Prosedur pelaksanaan penelitian ini terdiri dari beberapa tahapan utama sebagaimana diilustrasikan dalam diagram alir pada Gambar 1. Secara garis besar, penelitian mengikuti </w:t>
-      </w:r>
+        <w:t>Secara komprehensif, kerangka kerja eksperimental dan komputasional dalam penelitian ini divisualisasikan melalui diagram alir pada Gambar 1.</w:t>
+      </w:r>
+    </w:p>
+    <w:p>
       <w:r>
         <w:rPr>
-          <w:i/>
+          <w:b/>
         </w:rPr>
-        <w:t>two-stage workflow</w:t>
-      </w:r>
-      <w:r>
-        <w:t xml:space="preserve"> yang mengintegrasikan pendekatan berbasis simulasi fisika plasma dengan teknik </w:t>
+        <w:t>Gambar 1. Diagram Alir Penelitian</w:t>
+      </w:r>
+    </w:p>
+    <w:p/>
+    <w:p>
+      <w:pPr>
+        <w:pStyle w:val="Heading3"/>
+      </w:pPr>
+      <w:r>
+        <w:t>Prosedur Penelitian</w:t>
+      </w:r>
+    </w:p>
+    <w:p>
+      <w:r>
+        <w:t xml:space="preserve">Prosedur pelaksanaan penelitian ini terdiri dari 4 (empat) tahapan utama yang mendukung rancangan pada diagram alir di atas. Secara garis besar, penelitian mengikuti alur kerja yang mengintegrasikan pendekatan fisika eksperimental optik dan teknik </w:t>
       </w:r>
       <w:r>
         <w:rPr>
@@ -1220,18 +1233,9 @@
     </w:p>
     <w:p>
       <w:r>
-        <w:t>Kombinasi dua tahap ini dirancang untuk mengatasi keterbatasan jumlah data eksperimental yang tersedia (24 sampel) dengan cara memanfaatkan pengetahuan fisika plasma terlebih dahulu melalui data sintetis (Wang et al., 2024; Favre et al., 2025b), kemudian mentransfer representasi yang telah dipelajari ke domain eksperimental.</w:t>
+        <w:t>Kombinasi tahapan ini dirancang untuk mengatasi keterbatasan jumlah data eksperimental yang tersedia (24 sampel) dengan cara memanfaatkan pengetahuan fisika plasma terlebih dahulu melalui data sintetis (Wang et al., 2024; Favre et al., 2025b), kemudian mentransfer representasi yang telah dipelajari ke domain eksperimental.</w:t>
       </w:r>
     </w:p>
-    <w:p>
-      <w:r>
-        <w:rPr>
-          <w:b/>
-        </w:rPr>
-        <w:t>Gambar 1. Diagram Alir Penelitian</w:t>
-      </w:r>
-    </w:p>
-    <w:p/>
     <w:p>
       <w:r>
         <w:t xml:space="preserve">Keterbatasan utama dalam pengembangan model </w:t>
@@ -1270,15 +1274,39 @@
         <w:t>fine-tuning</w:t>
       </w:r>
       <w:r>
-        <w:t xml:space="preserve"> pada data eksperimental (Wang et al., 2024; Favre et al., 2025b). Tahapan pembangkitan data sintetis adalah sebagai berikut:</w:t>
+        <w:t xml:space="preserve"> pada data eksperimental (Wang et al., 2024; Favre et al., 2025b).</w:t>
       </w:r>
     </w:p>
     <w:p>
-      <w:pPr>
-        <w:pStyle w:val="ListNumber"/>
-      </w:pPr>
-      <w:r>
-        <w:t>Pengumpulan data transisi atomik dari NIST Atomic Spectra Database (Kramida et al., 2024): panjang gelombang transisi (λ_ki), koefisien Einstein (A_ki), degenerasi (g_i), dan energi level (E_i). Agar rentang simulasi bersifat representatif, parameter elemen dikompilasi secara spesifik untuk 8 elemen mayor dan 15 elemen jejak (trace elements) khas tanah vulkanik, dengan batasan rentang konsentrasi sesuai Tabel berikut:</w:t>
+      <w:r>
+        <w:t>Sebelum algoritma numerik dieksekusi, parameter input yang mencakup rentang konsentrasi (</w:t>
+      </w:r>
+      <w:r>
+        <w:rPr>
+          <w:i/>
+        </w:rPr>
+        <w:t>ground-truth</w:t>
+      </w:r>
+      <w:r>
+        <w:t xml:space="preserve"> sintetis) dan karakteristik instrumen fisis didefinisikan secara konstan terlebih dahulu. Rentang referensi kelompok elemen penyusun matriks disajikan secara komprehensif pada </w:t>
+      </w:r>
+      <w:r>
+        <w:rPr>
+          <w:b/>
+        </w:rPr>
+        <w:t>Tabel Rentang Referensi Komposisi Elemen</w:t>
+      </w:r>
+      <w:r>
+        <w:t xml:space="preserve">. Sementara batas variabel simulasi hukum fisikanya dipaparkan secara eksplisit di awal melalui </w:t>
+      </w:r>
+      <w:r>
+        <w:rPr>
+          <w:b/>
+        </w:rPr>
+        <w:t>Tabel Parameter Fisis dan Instrumental</w:t>
+      </w:r>
+      <w:r>
+        <w:t>.</w:t>
       </w:r>
     </w:p>
     <w:p>
@@ -2316,187 +2344,7 @@
           </w:tcPr>
           <w:p>
             <w:r>
-              <w:t>2. Penghitungan populasi analit memanfaatkan fondasi kesetimbangan termodinamika lokal (Local Thermodynamic Equilibrium / LTE). Distribusi elektron tereksitasi pada tingkat energi spesifik dikalkulasi berdasarkan Distribusi Boltzmann, dan keseimbangan densitas antar tingkat ionisasi saling berurutan dihitung menggunakan Persamaan Saha (Fujimoto, 2004). Parameter plasma dominan (Suhu elektron, T_e dan densitas elektron, n_e) pada kalkulasi fundamental ini kemudian di-sampling secara acak seragam: T_e ∈ [6.000–15.000] K, n_e ∈ [10^16 – 10^17] cm^{-3}. Pemilihan rentang ini secara sengaja disusun menyerupai kondisi tipikal transien plasma spektrum LIBS pada tekanan udara terbuka (Cristoforetti et al., 2010).</w:t>
-            </w:r>
-          </w:p>
-        </w:tc>
-        <w:tc>
-          <w:tcPr>
-            <w:tcW w:type="dxa" w:w="2160"/>
-          </w:tcPr>
-          <w:p>
-            <w:r/>
-          </w:p>
-        </w:tc>
-        <w:tc>
-          <w:tcPr>
-            <w:tcW w:type="dxa" w:w="2160"/>
-          </w:tcPr>
-          <w:p>
-            <w:r/>
-          </w:p>
-        </w:tc>
-        <w:tc>
-          <w:tcPr>
-            <w:tcW w:type="dxa" w:w="2160"/>
-          </w:tcPr>
-          <w:p>
-            <w:r/>
-          </w:p>
-        </w:tc>
-      </w:tr>
-      <w:tr>
-        <w:tc>
-          <w:tcPr>
-            <w:tcW w:type="dxa" w:w="2160"/>
-          </w:tcPr>
-          <w:p>
-            <w:r>
-              <w:t>3. Pembangkitan spektrum monoatomik S_mono^(z)(λ) per elemen dengan menjumlahkan koefisien emisi spektral menggunakan profil Voigt — konvolusi pelebaran Doppler dan Stark broadening (Griem, 1974). Profil Voigt dipilih karena merepresentasikan mekanisme pelebaran garis spektral dominan pada plasma LIBS, yaitu pelebaran termal (Doppler) dan pelebaran akibat interaksi elektron (Stark).</w:t>
-            </w:r>
-          </w:p>
-        </w:tc>
-        <w:tc>
-          <w:tcPr>
-            <w:tcW w:type="dxa" w:w="2160"/>
-          </w:tcPr>
-          <w:p>
-            <w:r/>
-          </w:p>
-        </w:tc>
-        <w:tc>
-          <w:tcPr>
-            <w:tcW w:type="dxa" w:w="2160"/>
-          </w:tcPr>
-          <w:p>
-            <w:r/>
-          </w:p>
-        </w:tc>
-        <w:tc>
-          <w:tcPr>
-            <w:tcW w:type="dxa" w:w="2160"/>
-          </w:tcPr>
-          <w:p>
-            <w:r/>
-          </w:p>
-        </w:tc>
-      </w:tr>
-      <w:tr>
-        <w:tc>
-          <w:tcPr>
-            <w:tcW w:type="dxa" w:w="2160"/>
-          </w:tcPr>
-          <w:p>
-            <w:r>
-              <w:t>4. Konstruksi spektrum poliatomik S_poly(λ) = Σ_z c_z · S_mono^(z)(λ) — superposisi terbobot konsentrasi fraksional. Tahap ini secara eksplisit mengimplementasikan hipotesis dekomposisi mono–poliatomik yang menjadi dasar arsitektur encoder–decoder.</w:t>
-            </w:r>
-          </w:p>
-        </w:tc>
-        <w:tc>
-          <w:tcPr>
-            <w:tcW w:type="dxa" w:w="2160"/>
-          </w:tcPr>
-          <w:p>
-            <w:r/>
-          </w:p>
-        </w:tc>
-        <w:tc>
-          <w:tcPr>
-            <w:tcW w:type="dxa" w:w="2160"/>
-          </w:tcPr>
-          <w:p>
-            <w:r/>
-          </w:p>
-        </w:tc>
-        <w:tc>
-          <w:tcPr>
-            <w:tcW w:type="dxa" w:w="2160"/>
-          </w:tcPr>
-          <w:p>
-            <w:r/>
-          </w:p>
-        </w:tc>
-      </w:tr>
-      <w:tr>
-        <w:tc>
-          <w:tcPr>
-            <w:tcW w:type="dxa" w:w="2160"/>
-          </w:tcPr>
-          <w:p>
-            <w:r>
-              <w:t>5. Konvolusi instrumental dengan fungsi Gaussian (FWHM = 0,02 nm) untuk mencocokkan resolusi spektrometer Echelle yang digunakan dalam eksperimen.</w:t>
-            </w:r>
-          </w:p>
-        </w:tc>
-        <w:tc>
-          <w:tcPr>
-            <w:tcW w:type="dxa" w:w="2160"/>
-          </w:tcPr>
-          <w:p>
-            <w:r/>
-          </w:p>
-        </w:tc>
-        <w:tc>
-          <w:tcPr>
-            <w:tcW w:type="dxa" w:w="2160"/>
-          </w:tcPr>
-          <w:p>
-            <w:r/>
-          </w:p>
-        </w:tc>
-        <w:tc>
-          <w:tcPr>
-            <w:tcW w:type="dxa" w:w="2160"/>
-          </w:tcPr>
-          <w:p>
-            <w:r/>
-          </w:p>
-        </w:tc>
-      </w:tr>
-      <w:tr>
-        <w:tc>
-          <w:tcPr>
-            <w:tcW w:type="dxa" w:w="2160"/>
-          </w:tcPr>
-          <w:p>
-            <w:r>
-              <w:t>6. Total dataset yang dibangkitkan: 10.000 pasangan spektrum sintetis (monoatomik + poliatomik beserta label konsentrasi dan parameter plasma), dibagi menjadi 80% untuk training dan 20% untuk test.</w:t>
-            </w:r>
-          </w:p>
-        </w:tc>
-        <w:tc>
-          <w:tcPr>
-            <w:tcW w:type="dxa" w:w="2160"/>
-          </w:tcPr>
-          <w:p>
-            <w:r/>
-          </w:p>
-        </w:tc>
-        <w:tc>
-          <w:tcPr>
-            <w:tcW w:type="dxa" w:w="2160"/>
-          </w:tcPr>
-          <w:p>
-            <w:r/>
-          </w:p>
-        </w:tc>
-        <w:tc>
-          <w:tcPr>
-            <w:tcW w:type="dxa" w:w="2160"/>
-          </w:tcPr>
-          <w:p>
-            <w:r/>
-          </w:p>
-        </w:tc>
-      </w:tr>
-      <w:tr>
-        <w:tc>
-          <w:tcPr>
-            <w:tcW w:type="dxa" w:w="2160"/>
-          </w:tcPr>
-          <w:p>
-            <w:r>
-              <w:t>7. Ringkasan seluruh parameter fisis dan komputasional yang dilibatkan dalam simulasi forward model spektral sintetis ini dirangkum pada Tabel berikut.</w:t>
+              <w:t>Tabel Parameter Fisis dan Instrumental Simulasi Data Sintetis</w:t>
             </w:r>
           </w:p>
         </w:tc>
@@ -2526,14 +2374,6 @@
         </w:tc>
       </w:tr>
     </w:tbl>
-    <w:p>
-      <w:r>
-        <w:rPr>
-          <w:b/>
-        </w:rPr>
-        <w:t>Tabel Parameter Fisis dan Instrumental Simulasi Data Sintetis</w:t>
-      </w:r>
-    </w:p>
     <w:tbl>
       <w:tblPr>
         <w:tblStyle w:val="TableGrid"/>
@@ -2802,6 +2642,59 @@
         </w:tc>
       </w:tr>
     </w:tbl>
+    <w:p>
+      <w:r>
+        <w:t>Setelah pondasi input di atas dipastikan secara ketat, tahapan operasional eksekusi logika pembangkitan data otomatis dikonstruksi secara programatik meliputi langkah berikut:</w:t>
+      </w:r>
+    </w:p>
+    <w:p>
+      <w:pPr>
+        <w:pStyle w:val="ListNumber"/>
+      </w:pPr>
+      <w:r>
+        <w:t>Pengumpulan data transisi atomik diunduh secara algoritmik dari database referensi (Kramida et al., 2024). Parameter konstan panjang gelombang ($\lambda_{ki}$), Einstein ($A_{ki}$), dan termal nukleus ($E_i$, $g_i$) diseleksi khusus menurut Tabel Rentang Referensi Komposisi Elemen.</w:t>
+      </w:r>
+    </w:p>
+    <w:p>
+      <w:pPr>
+        <w:pStyle w:val="ListNumber"/>
+      </w:pPr>
+      <w:r>
+        <w:t>Penghitungan populasi analit bersandar penuh pada kesetimbangan termodinamika lokal (Local Thermodynamic Equilibrium / LTE). Fraksi atom netral dan fraksi ion direkonsiliasi matematis berdasarkan Distribusi Boltzmann dan Persamaan Ionisasi Saha (Fujimoto, 2004). Parameter plasma dominan pendukung persamaan (Suhu elektron, T_e dan densitas elektron, n_e) pada kalkulasi fundamental ini kemudian di-sampling secara acak seragam: $T_e \in [6.000–15.000] K$, $n_e \in [10^{16} – 10^{17}] cm^{-3}$. Pemilihan rentang ini secara sengaja disusun menyerupai kondisi tipikal transien plasma spektrum LIBS pada tekanan atmosfer  (Cristoforetti et al., 2010).</w:t>
+      </w:r>
+    </w:p>
+    <w:p>
+      <w:pPr>
+        <w:pStyle w:val="ListNumber"/>
+      </w:pPr>
+      <w:r>
+        <w:t>Pembangkitan spektrum monoatomik ($S_\mathrm{mono}^{(z)}$) diformulasikan spesifik tiap elemen. Profil kurva Voigt dipilih untuk mensintesis intensitas (pelebaran termal Doppler diputar dengan turbulensi elektron Stark) meniru optika asli difraksi fisik plasma (Griem, 1974).</w:t>
+      </w:r>
+    </w:p>
+    <w:p>
+      <w:pPr>
+        <w:pStyle w:val="ListNumber"/>
+      </w:pPr>
+      <w:r>
+        <w:t>Konstruksi spektrum poliatomik campuran: memproyeksikan fraksi superposisi di seluruh sumbu spektrometer: $S_\mathrm{poly}(\lambda) = \sum_{z} c_z \cdot S_\mathrm{mono}^{(z)}(\lambda)$. Pada fase ini diatur konfigurasi dari koefisien variabel bebas $c_z$ diacak independen sebatas porsi tabel referensi komposisi.</w:t>
+      </w:r>
+    </w:p>
+    <w:p>
+      <w:pPr>
+        <w:pStyle w:val="ListNumber"/>
+      </w:pPr>
+      <w:r>
+        <w:t>Validasi final resolusi dieksekusi via kernel fungsi Gaussian setara (FWHM 0,02 nm) agar mencocokkan resolusi nyata spektrometer Echelle yang digerakkan pada fase eksperimen alat.</w:t>
+      </w:r>
+    </w:p>
+    <w:p>
+      <w:pPr>
+        <w:pStyle w:val="ListNumber"/>
+      </w:pPr>
+      <w:r>
+        <w:t>Total dataset yang dibangkitkan memformulasikan 10.000 pasangan spektrum sintetis (korelasi monoatomik + superposisi poliatomik dengan label parameter). Kumpulan data sintetis raksasa ini dibagi statis secara acak, mengecualikan 20\% sebagai tes untuk model dan 80\% mutlak untuk fondasi pramu-latih (pre-training) Deep Learning.</w:t>
+      </w:r>
+    </w:p>
     <w:p>
       <w:r>
         <w:rPr>

</xml_diff>